<commit_message>
partaisiju mazliet word dokumentu jeb aprakstu
</commit_message>
<xml_diff>
--- a/info_detalas/Petnieciskais_darbs_markussseglins_martinsklievens.docx
+++ b/info_detalas/Petnieciskais_darbs_markussseglins_martinsklievens.docx
@@ -2492,35 +2492,7 @@
         <w:rPr>
           <w:lang w:val="de-DE"/>
         </w:rPr>
-        <w:t xml:space="preserve"> (</w:t>
-      </w:r>
-      <w:proofErr w:type="spellStart"/>
-      <w:r>
-        <w:rPr>
-          <w:lang w:val="de-DE"/>
-        </w:rPr>
-        <w:t>Segliņš</w:t>
-      </w:r>
-      <w:proofErr w:type="spellEnd"/>
-      <w:r>
-        <w:rPr>
-          <w:lang w:val="de-DE"/>
-        </w:rPr>
-        <w:t xml:space="preserve"> &amp; </w:t>
-      </w:r>
-      <w:proofErr w:type="spellStart"/>
-      <w:r>
-        <w:rPr>
-          <w:lang w:val="de-DE"/>
-        </w:rPr>
-        <w:t>Klievēns</w:t>
-      </w:r>
-      <w:proofErr w:type="spellEnd"/>
-      <w:r>
-        <w:rPr>
-          <w:lang w:val="de-DE"/>
-        </w:rPr>
-        <w:t>, 2026a).</w:t>
+        <w:t xml:space="preserve"> </w:t>
       </w:r>
     </w:p>
     <w:p>
@@ -3842,35 +3814,7 @@
         <w:rPr>
           <w:lang w:val="de-DE"/>
         </w:rPr>
-        <w:t xml:space="preserve"> (</w:t>
-      </w:r>
-      <w:proofErr w:type="spellStart"/>
-      <w:r>
-        <w:rPr>
-          <w:lang w:val="de-DE"/>
-        </w:rPr>
-        <w:t>Segliņš</w:t>
-      </w:r>
-      <w:proofErr w:type="spellEnd"/>
-      <w:r>
-        <w:rPr>
-          <w:lang w:val="de-DE"/>
-        </w:rPr>
-        <w:t xml:space="preserve"> &amp; </w:t>
-      </w:r>
-      <w:proofErr w:type="spellStart"/>
-      <w:r>
-        <w:rPr>
-          <w:lang w:val="de-DE"/>
-        </w:rPr>
-        <w:t>Klievēns</w:t>
-      </w:r>
-      <w:proofErr w:type="spellEnd"/>
-      <w:r>
-        <w:rPr>
-          <w:lang w:val="de-DE"/>
-        </w:rPr>
-        <w:t>, 2026a).</w:t>
+        <w:t xml:space="preserve"> </w:t>
       </w:r>
     </w:p>
     <w:p>
@@ -6461,7 +6405,6 @@
           <w:rFonts w:ascii="Times New Roman" w:eastAsia="Times New Roman" w:hAnsi="Times New Roman" w:cs="Times New Roman"/>
           <w:lang w:val="de-DE"/>
         </w:rPr>
-        <w:lastRenderedPageBreak/>
         <w:t xml:space="preserve">1.1. </w:t>
       </w:r>
       <w:proofErr w:type="spellStart"/>
@@ -6906,6 +6849,7 @@
         <w:rPr>
           <w:lang w:val="de-DE"/>
         </w:rPr>
+        <w:lastRenderedPageBreak/>
         <w:t>konfidencialitāti</w:t>
       </w:r>
       <w:proofErr w:type="spellEnd"/>
@@ -8225,63 +8169,7 @@
         <w:rPr>
           <w:lang w:val="de-DE"/>
         </w:rPr>
-        <w:t xml:space="preserve"> (</w:t>
-      </w:r>
-      <w:proofErr w:type="spellStart"/>
-      <w:r>
-        <w:rPr>
-          <w:lang w:val="de-DE"/>
-        </w:rPr>
-        <w:t>Segliņš</w:t>
-      </w:r>
-      <w:proofErr w:type="spellEnd"/>
-      <w:r>
-        <w:rPr>
-          <w:lang w:val="de-DE"/>
-        </w:rPr>
-        <w:t xml:space="preserve"> &amp; </w:t>
-      </w:r>
-      <w:proofErr w:type="spellStart"/>
-      <w:r>
-        <w:rPr>
-          <w:lang w:val="de-DE"/>
-        </w:rPr>
-        <w:t>Klievēns</w:t>
-      </w:r>
-      <w:proofErr w:type="spellEnd"/>
-      <w:r>
-        <w:rPr>
-          <w:lang w:val="de-DE"/>
-        </w:rPr>
-        <w:t xml:space="preserve">, 2026a; </w:t>
-      </w:r>
-      <w:proofErr w:type="spellStart"/>
-      <w:r>
-        <w:rPr>
-          <w:lang w:val="de-DE"/>
-        </w:rPr>
-        <w:t>Segliņš</w:t>
-      </w:r>
-      <w:proofErr w:type="spellEnd"/>
-      <w:r>
-        <w:rPr>
-          <w:lang w:val="de-DE"/>
-        </w:rPr>
-        <w:t xml:space="preserve"> &amp; </w:t>
-      </w:r>
-      <w:proofErr w:type="spellStart"/>
-      <w:r>
-        <w:rPr>
-          <w:lang w:val="de-DE"/>
-        </w:rPr>
-        <w:t>Klievēns</w:t>
-      </w:r>
-      <w:proofErr w:type="spellEnd"/>
-      <w:r>
-        <w:rPr>
-          <w:lang w:val="de-DE"/>
-        </w:rPr>
-        <w:t>, 2026b).</w:t>
+        <w:t>.</w:t>
       </w:r>
     </w:p>
     <w:p>
@@ -10957,35 +10845,7 @@
         <w:rPr>
           <w:lang w:val="de-DE"/>
         </w:rPr>
-        <w:t xml:space="preserve"> (</w:t>
-      </w:r>
-      <w:proofErr w:type="spellStart"/>
-      <w:r>
-        <w:rPr>
-          <w:lang w:val="de-DE"/>
-        </w:rPr>
-        <w:t>Segliņš</w:t>
-      </w:r>
-      <w:proofErr w:type="spellEnd"/>
-      <w:r>
-        <w:rPr>
-          <w:lang w:val="de-DE"/>
-        </w:rPr>
-        <w:t xml:space="preserve"> &amp; </w:t>
-      </w:r>
-      <w:proofErr w:type="spellStart"/>
-      <w:r>
-        <w:rPr>
-          <w:lang w:val="de-DE"/>
-        </w:rPr>
-        <w:t>Klievēns</w:t>
-      </w:r>
-      <w:proofErr w:type="spellEnd"/>
-      <w:r>
-        <w:rPr>
-          <w:lang w:val="de-DE"/>
-        </w:rPr>
-        <w:t>, 2026b).</w:t>
+        <w:t xml:space="preserve"> </w:t>
       </w:r>
     </w:p>
     <w:p>
@@ -12433,7 +12293,6 @@
         <w:rPr>
           <w:lang w:val="de-DE"/>
         </w:rPr>
-        <w:lastRenderedPageBreak/>
         <w:t>Lokālas</w:t>
       </w:r>
       <w:proofErr w:type="spellEnd"/>
@@ -13151,40 +13010,6 @@
         <w:t>autentifikāciju</w:t>
       </w:r>
       <w:proofErr w:type="spellEnd"/>
-      <w:r>
-        <w:rPr>
-          <w:lang w:val="de-DE"/>
-        </w:rPr>
-        <w:t xml:space="preserve"> (</w:t>
-      </w:r>
-      <w:proofErr w:type="spellStart"/>
-      <w:r>
-        <w:rPr>
-          <w:lang w:val="de-DE"/>
-        </w:rPr>
-        <w:t>Segliņš</w:t>
-      </w:r>
-      <w:proofErr w:type="spellEnd"/>
-      <w:r>
-        <w:rPr>
-          <w:lang w:val="de-DE"/>
-        </w:rPr>
-        <w:t xml:space="preserve"> &amp; </w:t>
-      </w:r>
-      <w:proofErr w:type="spellStart"/>
-      <w:r>
-        <w:rPr>
-          <w:lang w:val="de-DE"/>
-        </w:rPr>
-        <w:t>Klievēns</w:t>
-      </w:r>
-      <w:proofErr w:type="spellEnd"/>
-      <w:r>
-        <w:rPr>
-          <w:lang w:val="de-DE"/>
-        </w:rPr>
-        <w:t>, 2026b).</w:t>
-      </w:r>
     </w:p>
     <w:p>
       <w:pPr>
@@ -13200,6 +13025,7 @@
         <w:rPr>
           <w:lang w:val="de-DE"/>
         </w:rPr>
+        <w:lastRenderedPageBreak/>
         <w:t>Lietotāja</w:t>
       </w:r>
       <w:proofErr w:type="spellEnd"/>
@@ -14460,7 +14286,7 @@
         <w:jc w:val="both"/>
       </w:pPr>
       <w:r>
-        <w:t>Ne mazāk svarīga par tehnoloģiju izvēli ir programmas iekšējā uzbūve. OOP pieeja ļauj sadalīt sistēmu vairākos atbildības slāņos: GUI, kontrolierī, servisos, datu modeļos un infrastruktūras komponentēs. Šāda pieeja samazina sasaisti starp vizuālo saskarni un kriptogrāfisko loģiku, atvieglo kļūdu apstrādi un padara sistēmu vieglāk paplašināmu (Segliņš &amp; Klievēns, 2026b).</w:t>
+        <w:t xml:space="preserve">Ne mazāk svarīga par tehnoloģiju izvēli ir programmas iekšējā uzbūve. OOP pieeja ļauj sadalīt sistēmu vairākos atbildības slāņos: GUI, kontrolierī, servisos, datu modeļos un infrastruktūras komponentēs. Šāda pieeja samazina sasaisti starp vizuālo saskarni un kriptogrāfisko loģiku, atvieglo kļūdu apstrādi un padara sistēmu vieglāk paplašināmu </w:t>
       </w:r>
     </w:p>
     <w:p>
@@ -14482,7 +14308,6 @@
         <w:jc w:val="both"/>
       </w:pPr>
       <w:r>
-        <w:lastRenderedPageBreak/>
         <w:t>Tādējādi teorētiskajā daļā tiek iegūts skaidrs pamatojums trim galvenajām izvēlēm: lokālai apstrādei, simetriskajai šifrēšanai ar Fernet un Tkinter balstītai lietotāja saskarnei, kas organizēta OOP struktūrā. Nākamajā nodaļā šīs izvēles tiek pārvērstas pētījuma metodēs un konkrētā izstrādes gaitā.</w:t>
       </w:r>
     </w:p>
@@ -14495,6 +14320,7 @@
         <w:rPr>
           <w:rFonts w:ascii="Times New Roman" w:eastAsia="Times New Roman" w:hAnsi="Times New Roman" w:cs="Times New Roman"/>
         </w:rPr>
+        <w:lastRenderedPageBreak/>
         <w:t>2. Pētījuma metodes un izstrādes gaita</w:t>
       </w:r>
     </w:p>
@@ -16250,144 +16076,8 @@
         <w:rPr>
           <w:lang w:val="de-DE"/>
         </w:rPr>
-        <w:t xml:space="preserve"> (</w:t>
-      </w:r>
-      <w:proofErr w:type="spellStart"/>
-      <w:r>
-        <w:rPr>
-          <w:lang w:val="de-DE"/>
-        </w:rPr>
-        <w:t>Segliņš</w:t>
-      </w:r>
-      <w:proofErr w:type="spellEnd"/>
-      <w:r>
-        <w:rPr>
-          <w:lang w:val="de-DE"/>
-        </w:rPr>
-        <w:t xml:space="preserve"> &amp; </w:t>
-      </w:r>
-      <w:proofErr w:type="spellStart"/>
-      <w:r>
-        <w:rPr>
-          <w:lang w:val="de-DE"/>
-        </w:rPr>
-        <w:t>Klievēns</w:t>
-      </w:r>
-      <w:proofErr w:type="spellEnd"/>
-      <w:r>
-        <w:rPr>
-          <w:lang w:val="de-DE"/>
-        </w:rPr>
-        <w:t xml:space="preserve">, 2026a; </w:t>
-      </w:r>
-      <w:proofErr w:type="spellStart"/>
-      <w:r>
-        <w:rPr>
-          <w:lang w:val="de-DE"/>
-        </w:rPr>
-        <w:t>Segliņš</w:t>
-      </w:r>
-      <w:proofErr w:type="spellEnd"/>
-      <w:r>
-        <w:rPr>
-          <w:lang w:val="de-DE"/>
-        </w:rPr>
-        <w:t xml:space="preserve"> &amp; </w:t>
-      </w:r>
-      <w:proofErr w:type="spellStart"/>
-      <w:r>
-        <w:rPr>
-          <w:lang w:val="de-DE"/>
-        </w:rPr>
-        <w:t>Klievēns</w:t>
-      </w:r>
-      <w:proofErr w:type="spellEnd"/>
-      <w:r>
-        <w:rPr>
-          <w:lang w:val="de-DE"/>
-        </w:rPr>
-        <w:t xml:space="preserve">, 2026b; Python Software </w:t>
-      </w:r>
-      <w:proofErr w:type="spellStart"/>
-      <w:r>
-        <w:rPr>
-          <w:lang w:val="de-DE"/>
-        </w:rPr>
-        <w:t>Foundation</w:t>
-      </w:r>
-      <w:proofErr w:type="spellEnd"/>
-      <w:r>
-        <w:rPr>
-          <w:lang w:val="de-DE"/>
-        </w:rPr>
-        <w:t xml:space="preserve">, </w:t>
-      </w:r>
-      <w:proofErr w:type="spellStart"/>
-      <w:r>
-        <w:rPr>
-          <w:lang w:val="de-DE"/>
-        </w:rPr>
-        <w:t>n.d</w:t>
-      </w:r>
-      <w:proofErr w:type="spellEnd"/>
-      <w:r>
-        <w:rPr>
-          <w:lang w:val="de-DE"/>
-        </w:rPr>
-        <w:t xml:space="preserve">.-a; The </w:t>
-      </w:r>
-      <w:proofErr w:type="spellStart"/>
-      <w:r>
-        <w:rPr>
-          <w:lang w:val="de-DE"/>
-        </w:rPr>
-        <w:t>cryptography</w:t>
-      </w:r>
-      <w:proofErr w:type="spellEnd"/>
-      <w:r>
-        <w:rPr>
-          <w:lang w:val="de-DE"/>
-        </w:rPr>
-        <w:t xml:space="preserve"> </w:t>
-      </w:r>
-      <w:proofErr w:type="spellStart"/>
-      <w:r>
-        <w:rPr>
-          <w:lang w:val="de-DE"/>
-        </w:rPr>
-        <w:t>developers</w:t>
-      </w:r>
-      <w:proofErr w:type="spellEnd"/>
-      <w:r>
-        <w:rPr>
-          <w:lang w:val="de-DE"/>
-        </w:rPr>
-        <w:t xml:space="preserve">, </w:t>
-      </w:r>
-      <w:proofErr w:type="spellStart"/>
-      <w:r>
-        <w:rPr>
-          <w:lang w:val="de-DE"/>
-        </w:rPr>
-        <w:t>n.d</w:t>
-      </w:r>
-      <w:proofErr w:type="spellEnd"/>
-      <w:r>
-        <w:rPr>
-          <w:lang w:val="de-DE"/>
-        </w:rPr>
-        <w:t>.).</w:t>
-      </w:r>
-    </w:p>
-    <w:p>
-      <w:pPr>
-        <w:spacing w:after="120" w:line="240" w:lineRule="auto"/>
-        <w:ind w:firstLine="709"/>
-        <w:jc w:val="both"/>
-        <w:rPr>
-          <w:lang w:val="de-DE"/>
-        </w:rPr>
-      </w:pPr>
+        <w:t xml:space="preserve"> </w:t>
+      </w:r>
       <w:proofErr w:type="spellStart"/>
       <w:r>
         <w:rPr>
@@ -18596,7 +18286,6 @@
             </w:pPr>
             <w:proofErr w:type="spellStart"/>
             <w:r>
-              <w:lastRenderedPageBreak/>
               <w:t>Kods</w:t>
             </w:r>
             <w:proofErr w:type="spellEnd"/>
@@ -18842,6 +18531,7 @@
               <w:jc w:val="center"/>
             </w:pPr>
             <w:r>
+              <w:lastRenderedPageBreak/>
               <w:t>F4</w:t>
             </w:r>
           </w:p>
@@ -19855,7 +19545,6 @@
         <w:rPr>
           <w:rFonts w:ascii="Times New Roman" w:eastAsia="Times New Roman" w:hAnsi="Times New Roman" w:cs="Times New Roman"/>
         </w:rPr>
-        <w:lastRenderedPageBreak/>
         <w:t>3. Rezultāti un to analīze</w:t>
       </w:r>
     </w:p>
@@ -19883,6 +19572,7 @@
           <w:b w:val="0"/>
           <w:sz w:val="24"/>
         </w:rPr>
+        <w:lastRenderedPageBreak/>
         <w:t>3.1. Izstrādātā risinājuma struktūra un funkcionalitāte</w:t>
       </w:r>
       <w:r>
@@ -19902,17 +19592,47 @@
         <w:jc w:val="both"/>
       </w:pPr>
       <w:r>
-        <w:t>Izstrādes rezultātā ir izveidots lokālas failu aizsardzības lietotnes modelis, kura centrā ir viena skaidra darbību secība: lietotājs izvēlas failu, ģenerē vai ielādē atslēgu, veic šifrēšanu vai atšifrēšanu un saņem nepārprotamu statusa ziņojumu. Šāda plūsma pilnībā atbilst pirmajā posmā noteiktajai iecerei izveidot vienkāršu, saprotamu un lokāli darbināmu Python lietotni (Segliņš &amp; Klievēns, 2026a).</w:t>
-      </w:r>
-    </w:p>
-    <w:p>
-      <w:pPr>
-        <w:spacing w:after="120" w:line="240" w:lineRule="auto"/>
-        <w:ind w:firstLine="709"/>
-        <w:jc w:val="both"/>
-      </w:pPr>
-      <w:r>
-        <w:t>No arhitektūras viedokļa būtiskākais sasniegtais rezultāts ir biznesa loģikas nodalīšana no lietotāja saskarnes. MainWindow apkopo lietotāja darbības, EncryptionController koordinē procesu, savukārt servisu slānis veic katru atbildību atsevišķi: failu nolasīšanu, atslēgu apstrādi, šifrēšanu un validāciju. Tas samazina haotisku atkarību starp koda daļām un ļauj katru komponenti testēt neatkarīgāk (Segliņš &amp; Klievēns, 2026b).</w:t>
+        <w:t xml:space="preserve">Izstrādes rezultātā ir izveidots lokālas failu aizsardzības lietotnes modelis, kura centrā ir viena skaidra darbību secība: lietotājs izvēlas failu, ģenerē vai ielādē atslēgu, veic šifrēšanu vai atšifrēšanu un saņem nepārprotamu statusa ziņojumu. Šāda plūsma pilnībā atbilst pirmajā posmā noteiktajai iecerei izveidot vienkāršu, saprotamu un lokāli </w:t>
+      </w:r>
+      <w:proofErr w:type="spellStart"/>
+      <w:r>
+        <w:t>darbināmu</w:t>
+      </w:r>
+      <w:proofErr w:type="spellEnd"/>
+      <w:r>
+        <w:t xml:space="preserve"> Python </w:t>
+      </w:r>
+      <w:proofErr w:type="spellStart"/>
+      <w:r>
+        <w:t>lietotni</w:t>
+      </w:r>
+      <w:proofErr w:type="spellEnd"/>
+      <w:r>
+        <w:t xml:space="preserve"> No </w:t>
+      </w:r>
+      <w:proofErr w:type="spellStart"/>
+      <w:r>
+        <w:t>arhitektūras</w:t>
+      </w:r>
+      <w:proofErr w:type="spellEnd"/>
+      <w:r>
+        <w:t xml:space="preserve"> </w:t>
+      </w:r>
+      <w:proofErr w:type="spellStart"/>
+      <w:r>
+        <w:t>viedokļa</w:t>
+      </w:r>
+      <w:proofErr w:type="spellEnd"/>
+      <w:r>
+        <w:t xml:space="preserve"> </w:t>
+      </w:r>
+      <w:proofErr w:type="spellStart"/>
+      <w:r>
+        <w:t>būtiskākais</w:t>
+      </w:r>
+      <w:proofErr w:type="spellEnd"/>
+      <w:r>
+        <w:t xml:space="preserve"> sasniegtais rezultāts ir biznesa loģikas nodalīšana no lietotāja saskarnes. MainWindow apkopo lietotāja darbības, EncryptionController koordinē procesu, savukārt servisu slānis veic katru atbildību atsevišķi: failu nolasīšanu, atslēgu apstrādi, šifrēšanu un validāciju. Tas samazina haotisku atkarību starp koda daļām un ļauj katru komponenti testēt neatkarīgāk </w:t>
       </w:r>
     </w:p>
     <w:p>
@@ -20013,7 +19733,6 @@
         <w:rPr>
           <w:b/>
         </w:rPr>
-        <w:lastRenderedPageBreak/>
         <w:t>4. tabula. Validācijas scenāriju izvērtējums izstrādātā risinājuma kontekstā</w:t>
       </w:r>
     </w:p>
@@ -20223,6 +19942,7 @@
               <w:rPr>
                 <w:lang w:val="de-DE"/>
               </w:rPr>
+              <w:lastRenderedPageBreak/>
               <w:t xml:space="preserve">T2. </w:t>
             </w:r>
             <w:proofErr w:type="spellStart"/>
@@ -20306,7 +20026,15 @@
             </w:r>
             <w:proofErr w:type="spellEnd"/>
             <w:r>
-              <w:t xml:space="preserve"> un saturs atjaunojams.</w:t>
+              <w:t xml:space="preserve"> un </w:t>
+            </w:r>
+            <w:proofErr w:type="spellStart"/>
+            <w:r>
+              <w:t>saturs</w:t>
+            </w:r>
+            <w:proofErr w:type="spellEnd"/>
+            <w:r>
+              <w:t xml:space="preserve"> atjaunojams.</w:t>
             </w:r>
           </w:p>
         </w:tc>
@@ -20825,11 +20553,7 @@
         <w:jc w:val="both"/>
       </w:pPr>
       <w:r>
-        <w:t xml:space="preserve">Kopumā rezultātu analīze ļauj secināt, ka projekta apraksts ir ne tikai teorētiski saskanīgs, bet arī strukturāli pamatots. Tas saglabā tiešu saikni ar pirmā posma atskaiti un detalizēto OOP </w:t>
-      </w:r>
-      <w:r>
-        <w:lastRenderedPageBreak/>
-        <w:t>programmas aprakstu, vienlaikus pārvēršot tos pētniecības darba formātā ar skaidrāk nodalītām metodēm, rezultātiem un secinājumiem.</w:t>
+        <w:t>Kopumā rezultātu analīze ļauj secināt, ka projekta apraksts ir ne tikai teorētiski saskanīgs, bet arī strukturāli pamatots. Tas saglabā tiešu saikni ar pirmā posma atskaiti un detalizēto OOP programmas aprakstu, vienlaikus pārvēršot tos pētniecības darba formātā ar skaidrāk nodalītām metodēm, rezultātiem un secinājumiem.</w:t>
       </w:r>
     </w:p>
     <w:p>
@@ -20875,6 +20599,7 @@
         <w:jc w:val="both"/>
       </w:pPr>
       <w:r>
+        <w:lastRenderedPageBreak/>
         <w:t>2. Pirmajā posmā izvirzītais mērķis un uzdevumi ir saglabājami arī pētniecības darba aprakstā, jo tie precīzi raksturo projekta būtību: izstrādāt vienkāršu lokālu Python lietotni drošai failu šifrēšanai un atšifrēšanai.</w:t>
       </w:r>
     </w:p>
@@ -20972,288 +20697,6 @@
       </w:pPr>
       <w:r>
         <w:t>Python Software Foundation. (n.d.-c). logging — Logging facility for Python. Pieejams: https://docs.python.org/3/library/logging.html</w:t>
-      </w:r>
-    </w:p>
-    <w:p>
-      <w:pPr>
-        <w:spacing w:after="120" w:line="240" w:lineRule="auto"/>
-        <w:ind w:firstLine="709"/>
-        <w:jc w:val="both"/>
-        <w:rPr>
-          <w:lang w:val="de-DE"/>
-        </w:rPr>
-      </w:pPr>
-      <w:r>
-        <w:t xml:space="preserve">Segliņš, M., &amp; Klievēns, M. (2026a). </w:t>
-      </w:r>
-      <w:proofErr w:type="spellStart"/>
-      <w:r>
-        <w:rPr>
-          <w:lang w:val="de-DE"/>
-        </w:rPr>
-        <w:t>Pētniecības</w:t>
-      </w:r>
-      <w:proofErr w:type="spellEnd"/>
-      <w:r>
-        <w:rPr>
-          <w:lang w:val="de-DE"/>
-        </w:rPr>
-        <w:t xml:space="preserve"> </w:t>
-      </w:r>
-      <w:proofErr w:type="spellStart"/>
-      <w:r>
-        <w:rPr>
-          <w:lang w:val="de-DE"/>
-        </w:rPr>
-        <w:t>darbs</w:t>
-      </w:r>
-      <w:proofErr w:type="spellEnd"/>
-      <w:r>
-        <w:rPr>
-          <w:lang w:val="de-DE"/>
-        </w:rPr>
-        <w:t xml:space="preserve">: 1. </w:t>
-      </w:r>
-      <w:proofErr w:type="spellStart"/>
-      <w:r>
-        <w:rPr>
-          <w:lang w:val="de-DE"/>
-        </w:rPr>
-        <w:t>posms</w:t>
-      </w:r>
-      <w:proofErr w:type="spellEnd"/>
-      <w:r>
-        <w:rPr>
-          <w:lang w:val="de-DE"/>
-        </w:rPr>
-        <w:t xml:space="preserve">. </w:t>
-      </w:r>
-      <w:proofErr w:type="spellStart"/>
-      <w:r>
-        <w:rPr>
-          <w:lang w:val="de-DE"/>
-        </w:rPr>
-        <w:t>Nepublicēts</w:t>
-      </w:r>
-      <w:proofErr w:type="spellEnd"/>
-      <w:r>
-        <w:rPr>
-          <w:lang w:val="de-DE"/>
-        </w:rPr>
-        <w:t xml:space="preserve"> </w:t>
-      </w:r>
-      <w:proofErr w:type="spellStart"/>
-      <w:r>
-        <w:rPr>
-          <w:lang w:val="de-DE"/>
-        </w:rPr>
-        <w:t>projekta</w:t>
-      </w:r>
-      <w:proofErr w:type="spellEnd"/>
-      <w:r>
-        <w:rPr>
-          <w:lang w:val="de-DE"/>
-        </w:rPr>
-        <w:t xml:space="preserve"> </w:t>
-      </w:r>
-      <w:proofErr w:type="spellStart"/>
-      <w:r>
-        <w:rPr>
-          <w:lang w:val="de-DE"/>
-        </w:rPr>
-        <w:t>materiāls</w:t>
-      </w:r>
-      <w:proofErr w:type="spellEnd"/>
-      <w:r>
-        <w:rPr>
-          <w:lang w:val="de-DE"/>
-        </w:rPr>
-        <w:t>.</w:t>
-      </w:r>
-    </w:p>
-    <w:p>
-      <w:pPr>
-        <w:spacing w:after="120" w:line="240" w:lineRule="auto"/>
-        <w:ind w:firstLine="709"/>
-        <w:jc w:val="both"/>
-      </w:pPr>
-      <w:proofErr w:type="spellStart"/>
-      <w:r>
-        <w:rPr>
-          <w:lang w:val="de-DE"/>
-        </w:rPr>
-        <w:t>Segliņš</w:t>
-      </w:r>
-      <w:proofErr w:type="spellEnd"/>
-      <w:r>
-        <w:rPr>
-          <w:lang w:val="de-DE"/>
-        </w:rPr>
-        <w:t xml:space="preserve">, M., &amp; </w:t>
-      </w:r>
-      <w:proofErr w:type="spellStart"/>
-      <w:r>
-        <w:rPr>
-          <w:lang w:val="de-DE"/>
-        </w:rPr>
-        <w:t>Klievēns</w:t>
-      </w:r>
-      <w:proofErr w:type="spellEnd"/>
-      <w:r>
-        <w:rPr>
-          <w:lang w:val="de-DE"/>
-        </w:rPr>
-        <w:t xml:space="preserve">, M. (2026b). </w:t>
-      </w:r>
-      <w:proofErr w:type="spellStart"/>
-      <w:r>
-        <w:rPr>
-          <w:lang w:val="de-DE"/>
-        </w:rPr>
-        <w:t>Failu</w:t>
-      </w:r>
-      <w:proofErr w:type="spellEnd"/>
-      <w:r>
-        <w:rPr>
-          <w:lang w:val="de-DE"/>
-        </w:rPr>
-        <w:t xml:space="preserve"> </w:t>
-      </w:r>
-      <w:proofErr w:type="spellStart"/>
-      <w:r>
-        <w:rPr>
-          <w:lang w:val="de-DE"/>
-        </w:rPr>
-        <w:t>drošības</w:t>
-      </w:r>
-      <w:proofErr w:type="spellEnd"/>
-      <w:r>
-        <w:rPr>
-          <w:lang w:val="de-DE"/>
-        </w:rPr>
-        <w:t xml:space="preserve"> </w:t>
-      </w:r>
-      <w:proofErr w:type="spellStart"/>
-      <w:r>
-        <w:rPr>
-          <w:lang w:val="de-DE"/>
-        </w:rPr>
-        <w:t>nodrošināšana</w:t>
-      </w:r>
-      <w:proofErr w:type="spellEnd"/>
-      <w:r>
-        <w:rPr>
-          <w:lang w:val="de-DE"/>
-        </w:rPr>
-        <w:t xml:space="preserve"> </w:t>
-      </w:r>
-      <w:proofErr w:type="spellStart"/>
-      <w:r>
-        <w:rPr>
-          <w:lang w:val="de-DE"/>
-        </w:rPr>
-        <w:t>ar</w:t>
-      </w:r>
-      <w:proofErr w:type="spellEnd"/>
-      <w:r>
-        <w:rPr>
-          <w:lang w:val="de-DE"/>
-        </w:rPr>
-        <w:t xml:space="preserve"> </w:t>
-      </w:r>
-      <w:proofErr w:type="spellStart"/>
-      <w:r>
-        <w:rPr>
-          <w:lang w:val="de-DE"/>
-        </w:rPr>
-        <w:t>lokālu</w:t>
-      </w:r>
-      <w:proofErr w:type="spellEnd"/>
-      <w:r>
-        <w:rPr>
-          <w:lang w:val="de-DE"/>
-        </w:rPr>
-        <w:t xml:space="preserve"> Python </w:t>
-      </w:r>
-      <w:proofErr w:type="spellStart"/>
-      <w:r>
-        <w:rPr>
-          <w:lang w:val="de-DE"/>
-        </w:rPr>
-        <w:t>lietotni</w:t>
-      </w:r>
-      <w:proofErr w:type="spellEnd"/>
-      <w:r>
-        <w:rPr>
-          <w:lang w:val="de-DE"/>
-        </w:rPr>
-        <w:t xml:space="preserve">: </w:t>
-      </w:r>
-      <w:proofErr w:type="spellStart"/>
-      <w:r>
-        <w:rPr>
-          <w:lang w:val="de-DE"/>
-        </w:rPr>
-        <w:t>detalizēts</w:t>
-      </w:r>
-      <w:proofErr w:type="spellEnd"/>
-      <w:r>
-        <w:rPr>
-          <w:lang w:val="de-DE"/>
-        </w:rPr>
-        <w:t xml:space="preserve"> OOP </w:t>
-      </w:r>
-      <w:proofErr w:type="spellStart"/>
-      <w:r>
-        <w:rPr>
-          <w:lang w:val="de-DE"/>
-        </w:rPr>
-        <w:t>programmas</w:t>
-      </w:r>
-      <w:proofErr w:type="spellEnd"/>
-      <w:r>
-        <w:rPr>
-          <w:lang w:val="de-DE"/>
-        </w:rPr>
-        <w:t xml:space="preserve"> </w:t>
-      </w:r>
-      <w:proofErr w:type="spellStart"/>
-      <w:r>
-        <w:rPr>
-          <w:lang w:val="de-DE"/>
-        </w:rPr>
-        <w:t>apraksts</w:t>
-      </w:r>
-      <w:proofErr w:type="spellEnd"/>
-      <w:r>
-        <w:rPr>
-          <w:lang w:val="de-DE"/>
-        </w:rPr>
-        <w:t xml:space="preserve">. </w:t>
-      </w:r>
-      <w:proofErr w:type="spellStart"/>
-      <w:r>
-        <w:t>Nepublicēts</w:t>
-      </w:r>
-      <w:proofErr w:type="spellEnd"/>
-      <w:r>
-        <w:t xml:space="preserve"> </w:t>
-      </w:r>
-      <w:proofErr w:type="spellStart"/>
-      <w:r>
-        <w:t>projekta</w:t>
-      </w:r>
-      <w:proofErr w:type="spellEnd"/>
-      <w:r>
-        <w:t xml:space="preserve"> </w:t>
-      </w:r>
-      <w:proofErr w:type="spellStart"/>
-      <w:r>
-        <w:t>materiāls</w:t>
-      </w:r>
-      <w:proofErr w:type="spellEnd"/>
-      <w:r>
-        <w:t>.</w:t>
       </w:r>
     </w:p>
     <w:p>

</xml_diff>